<commit_message>
Add branded vs unbranded guidance to urgent plan
Answers whether KSh 350 godown stock is branded (it is not), distinguishes
the unbranded fashion items in the reference screenshots from brand-look
copies, compares the two sourcing routes by profit, and flags Uganda
counterfeit law exposure under Penal Code s.379 and the 2023/24 Bill.

Co-authored-by: arena-agent <297053741+arena-agent@users.noreply.github.com>
</commit_message>
<xml_diff>
--- a/Urgent-Final-Day-Buying-Plan.docx
+++ b/Urgent-Final-Day-Buying-Plan.docx
@@ -2216,6 +2216,992 @@
         <w:pStyle w:val="Heading1"/>
       </w:pPr>
       <w:r>
+        <w:t>WILL YOU GET BRANDED ONES? — Read this before you buy</w:t>
+      </w:r>
+    </w:p>
+    <w:p>
+      <w:pPr>
+        <w:pStyle w:val="Heading2"/>
+      </w:pPr>
+      <w:r>
+        <w:t>Short answer: No.</w:t>
+      </w:r>
+    </w:p>
+    <w:p>
+      <w:pPr>
+        <w:spacing w:after="120"/>
+      </w:pPr>
+      <w:r>
+        <w:rPr>
+          <w:b/>
+        </w:rPr>
+        <w:t>At KSh 350 a polo, you are getting a plain, unbranded polo.</w:t>
+      </w:r>
+      <w:r>
+        <w:t xml:space="preserve"> You cannot buy a genuine U.S. Polo Assn. or Timberland shirt for KSh 350 (~$2.70). Genuine USPA polos sell used on eBay for $10–40. The maths is impossible.</w:t>
+      </w:r>
+    </w:p>
+    <w:p>
+      <w:pPr>
+        <w:pStyle w:val="Heading2"/>
+      </w:pPr>
+      <w:r>
+        <w:t>What was actually in your screenshots</w:t>
+      </w:r>
+    </w:p>
+    <w:p>
+      <w:pPr>
+        <w:spacing w:after="120"/>
+      </w:pPr>
+      <w:r>
+        <w:t xml:space="preserve">Looking back at them carefully, you showed </w:t>
+      </w:r>
+      <w:r>
+        <w:rPr>
+          <w:b/>
+        </w:rPr>
+        <w:t>two different things</w:t>
+      </w:r>
+      <w:r>
+        <w:t>:</w:t>
+      </w:r>
+    </w:p>
+    <w:tbl>
+      <w:tblPr>
+        <w:tblStyle w:val="TableGrid"/>
+        <w:tblW w:type="auto" w:w="0"/>
+        <w:jc w:val="left"/>
+        <w:tblLook w:firstColumn="1" w:firstRow="1" w:lastColumn="0" w:lastRow="0" w:noHBand="0" w:noVBand="1" w:val="04A0"/>
+      </w:tblPr>
+      <w:tblGrid>
+        <w:gridCol w:w="3312"/>
+        <w:gridCol w:w="3312"/>
+        <w:gridCol w:w="3312"/>
+      </w:tblGrid>
+      <w:tr>
+        <w:tc>
+          <w:tcPr>
+            <w:tcW w:type="dxa" w:w="3312"/>
+            <w:shd w:val="clear" w:color="auto" w:fill="E7EEF7"/>
+          </w:tcPr>
+          <w:p>
+            <w:pPr>
+              <w:spacing w:after="40"/>
+            </w:pPr>
+            <w:r>
+              <w:rPr>
+                <w:b/>
+                <w:sz w:val="19"/>
+              </w:rPr>
+            </w:r>
+            <w:r>
+              <w:rPr>
+                <w:b/>
+                <w:sz w:val="19"/>
+              </w:rPr>
+              <w:t>Type</w:t>
+            </w:r>
+          </w:p>
+        </w:tc>
+        <w:tc>
+          <w:tcPr>
+            <w:tcW w:type="dxa" w:w="3312"/>
+            <w:shd w:val="clear" w:color="auto" w:fill="E7EEF7"/>
+          </w:tcPr>
+          <w:p>
+            <w:pPr>
+              <w:spacing w:after="40"/>
+            </w:pPr>
+            <w:r>
+              <w:rPr>
+                <w:b/>
+                <w:sz w:val="19"/>
+              </w:rPr>
+            </w:r>
+            <w:r>
+              <w:rPr>
+                <w:b/>
+                <w:sz w:val="19"/>
+              </w:rPr>
+              <w:t>Examples from your pics</w:t>
+            </w:r>
+          </w:p>
+        </w:tc>
+        <w:tc>
+          <w:tcPr>
+            <w:tcW w:type="dxa" w:w="3312"/>
+            <w:shd w:val="clear" w:color="auto" w:fill="E7EEF7"/>
+          </w:tcPr>
+          <w:p>
+            <w:pPr>
+              <w:spacing w:after="40"/>
+            </w:pPr>
+            <w:r>
+              <w:rPr>
+                <w:b/>
+                <w:sz w:val="19"/>
+              </w:rPr>
+            </w:r>
+            <w:r>
+              <w:rPr>
+                <w:b/>
+                <w:sz w:val="19"/>
+              </w:rPr>
+              <w:t>Branded?</w:t>
+            </w:r>
+          </w:p>
+        </w:tc>
+      </w:tr>
+      <w:tr>
+        <w:tc>
+          <w:tcPr>
+            <w:tcW w:type="dxa" w:w="3312"/>
+          </w:tcPr>
+          <w:p>
+            <w:pPr>
+              <w:spacing w:after="40"/>
+            </w:pPr>
+            <w:r>
+              <w:rPr>
+                <w:sz w:val="19"/>
+              </w:rPr>
+            </w:r>
+            <w:r>
+              <w:rPr>
+                <w:b/>
+                <w:sz w:val="19"/>
+              </w:rPr>
+              <w:t>Unbranded fashion</w:t>
+            </w:r>
+          </w:p>
+        </w:tc>
+        <w:tc>
+          <w:tcPr>
+            <w:tcW w:type="dxa" w:w="3312"/>
+          </w:tcPr>
+          <w:p>
+            <w:pPr>
+              <w:spacing w:after="40"/>
+            </w:pPr>
+            <w:r>
+              <w:rPr>
+                <w:sz w:val="19"/>
+              </w:rPr>
+            </w:r>
+            <w:r>
+              <w:rPr>
+                <w:sz w:val="19"/>
+              </w:rPr>
+              <w:t>aa_apparel textured polos, CUBANS striped shirts, ZVA tees, GESLA jeans</w:t>
+            </w:r>
+          </w:p>
+        </w:tc>
+        <w:tc>
+          <w:tcPr>
+            <w:tcW w:type="dxa" w:w="3312"/>
+          </w:tcPr>
+          <w:p>
+            <w:pPr>
+              <w:spacing w:after="40"/>
+            </w:pPr>
+            <w:r>
+              <w:rPr>
+                <w:sz w:val="19"/>
+              </w:rPr>
+            </w:r>
+            <w:r>
+              <w:rPr>
+                <w:sz w:val="19"/>
+              </w:rPr>
+              <w:t xml:space="preserve">❌ No logo. Just "CASUAL SMART" text. </w:t>
+            </w:r>
+            <w:r>
+              <w:rPr>
+                <w:b/>
+                <w:sz w:val="19"/>
+              </w:rPr>
+              <w:t>These are generic imports.</w:t>
+            </w:r>
+          </w:p>
+        </w:tc>
+      </w:tr>
+      <w:tr>
+        <w:tc>
+          <w:tcPr>
+            <w:tcW w:type="dxa" w:w="3312"/>
+          </w:tcPr>
+          <w:p>
+            <w:pPr>
+              <w:spacing w:after="40"/>
+            </w:pPr>
+            <w:r>
+              <w:rPr>
+                <w:sz w:val="19"/>
+              </w:rPr>
+            </w:r>
+            <w:r>
+              <w:rPr>
+                <w:b/>
+                <w:sz w:val="19"/>
+              </w:rPr>
+              <w:t>Brand-look items</w:t>
+            </w:r>
+          </w:p>
+        </w:tc>
+        <w:tc>
+          <w:tcPr>
+            <w:tcW w:type="dxa" w:w="3312"/>
+          </w:tcPr>
+          <w:p>
+            <w:pPr>
+              <w:spacing w:after="40"/>
+            </w:pPr>
+            <w:r>
+              <w:rPr>
+                <w:sz w:val="19"/>
+              </w:rPr>
+            </w:r>
+            <w:r>
+              <w:rPr>
+                <w:sz w:val="19"/>
+              </w:rPr>
+              <w:t>U.S. Polo Assn. shirt, Timberland shirts, aape collar shirts</w:t>
+            </w:r>
+          </w:p>
+        </w:tc>
+        <w:tc>
+          <w:tcPr>
+            <w:tcW w:type="dxa" w:w="3312"/>
+          </w:tcPr>
+          <w:p>
+            <w:pPr>
+              <w:spacing w:after="40"/>
+            </w:pPr>
+            <w:r>
+              <w:rPr>
+                <w:sz w:val="19"/>
+              </w:rPr>
+            </w:r>
+            <w:r>
+              <w:rPr>
+                <w:sz w:val="19"/>
+              </w:rPr>
+              <w:t>⚠️ Style copies</w:t>
+            </w:r>
+          </w:p>
+        </w:tc>
+      </w:tr>
+    </w:tbl>
+    <w:p/>
+    <w:p>
+      <w:pPr>
+        <w:spacing w:after="120"/>
+      </w:pPr>
+      <w:r>
+        <w:rPr>
+          <w:b/>
+        </w:rPr>
+        <w:t>Most of what you screenshotted is unbranded.</w:t>
+      </w:r>
+      <w:r>
+        <w:t xml:space="preserve"> Those textured polos and Cuban collars are Chinese/Turkish imports with no brand — they retail at UGX 45,000 on </w:t>
+      </w:r>
+      <w:r>
+        <w:rPr>
+          <w:b/>
+        </w:rPr>
+        <w:t>style and quality</w:t>
+      </w:r>
+      <w:r>
+        <w:t>, not on a logo.</w:t>
+      </w:r>
+    </w:p>
+    <w:p>
+      <w:pPr>
+        <w:pStyle w:val="Heading2"/>
+      </w:pPr>
+      <w:r>
+        <w:t>But here is the catch</w:t>
+      </w:r>
+    </w:p>
+    <w:p>
+      <w:pPr>
+        <w:spacing w:after="120"/>
+      </w:pPr>
+      <w:r>
+        <w:rPr>
+          <w:b/>
+        </w:rPr>
+        <w:t>KSh 350 godown polos are BASIC, not FASHION.</w:t>
+      </w:r>
+    </w:p>
+    <w:p>
+      <w:pPr>
+        <w:spacing w:after="120"/>
+      </w:pPr>
+      <w:r>
+        <w:t xml:space="preserve">The polos in your pics are textured knit, fashion-cut, with collar tipping. A godown basic polo is a plain cotton polo. They are </w:t>
+      </w:r>
+      <w:r>
+        <w:rPr>
+          <w:b/>
+        </w:rPr>
+        <w:t>not the same product</w:t>
+      </w:r>
+      <w:r>
+        <w:t>, and they won't fetch the same price.</w:t>
+      </w:r>
+    </w:p>
+    <w:tbl>
+      <w:tblPr>
+        <w:tblStyle w:val="TableGrid"/>
+        <w:tblW w:type="auto" w:w="0"/>
+        <w:jc w:val="left"/>
+        <w:tblLook w:firstColumn="1" w:firstRow="1" w:lastColumn="0" w:lastRow="0" w:noHBand="0" w:noVBand="1" w:val="04A0"/>
+      </w:tblPr>
+      <w:tblGrid>
+        <w:gridCol w:w="3312"/>
+        <w:gridCol w:w="3312"/>
+        <w:gridCol w:w="3312"/>
+      </w:tblGrid>
+      <w:tr>
+        <w:tc>
+          <w:tcPr>
+            <w:tcW w:type="dxa" w:w="3312"/>
+            <w:shd w:val="clear" w:color="auto" w:fill="E7EEF7"/>
+          </w:tcPr>
+          <w:p>
+            <w:pPr>
+              <w:spacing w:after="40"/>
+            </w:pPr>
+            <w:r>
+              <w:rPr>
+                <w:b/>
+                <w:sz w:val="19"/>
+              </w:rPr>
+            </w:r>
+          </w:p>
+        </w:tc>
+        <w:tc>
+          <w:tcPr>
+            <w:tcW w:type="dxa" w:w="3312"/>
+            <w:shd w:val="clear" w:color="auto" w:fill="E7EEF7"/>
+          </w:tcPr>
+          <w:p>
+            <w:pPr>
+              <w:spacing w:after="40"/>
+            </w:pPr>
+            <w:r>
+              <w:rPr>
+                <w:b/>
+                <w:sz w:val="19"/>
+              </w:rPr>
+            </w:r>
+            <w:r>
+              <w:rPr>
+                <w:b/>
+                <w:sz w:val="19"/>
+              </w:rPr>
+              <w:t>Godown basic polo</w:t>
+            </w:r>
+          </w:p>
+        </w:tc>
+        <w:tc>
+          <w:tcPr>
+            <w:tcW w:type="dxa" w:w="3312"/>
+            <w:shd w:val="clear" w:color="auto" w:fill="E7EEF7"/>
+          </w:tcPr>
+          <w:p>
+            <w:pPr>
+              <w:spacing w:after="40"/>
+            </w:pPr>
+            <w:r>
+              <w:rPr>
+                <w:b/>
+                <w:sz w:val="19"/>
+              </w:rPr>
+            </w:r>
+            <w:r>
+              <w:rPr>
+                <w:b/>
+                <w:sz w:val="19"/>
+              </w:rPr>
+              <w:t>The polos in your pics</w:t>
+            </w:r>
+          </w:p>
+        </w:tc>
+      </w:tr>
+      <w:tr>
+        <w:tc>
+          <w:tcPr>
+            <w:tcW w:type="dxa" w:w="3312"/>
+          </w:tcPr>
+          <w:p>
+            <w:pPr>
+              <w:spacing w:after="40"/>
+            </w:pPr>
+            <w:r>
+              <w:rPr>
+                <w:sz w:val="19"/>
+              </w:rPr>
+            </w:r>
+            <w:r>
+              <w:rPr>
+                <w:sz w:val="19"/>
+              </w:rPr>
+              <w:t>Cost</w:t>
+            </w:r>
+          </w:p>
+        </w:tc>
+        <w:tc>
+          <w:tcPr>
+            <w:tcW w:type="dxa" w:w="3312"/>
+          </w:tcPr>
+          <w:p>
+            <w:pPr>
+              <w:spacing w:after="40"/>
+            </w:pPr>
+            <w:r>
+              <w:rPr>
+                <w:sz w:val="19"/>
+              </w:rPr>
+            </w:r>
+            <w:r>
+              <w:rPr>
+                <w:sz w:val="19"/>
+              </w:rPr>
+              <w:t>KSh 350</w:t>
+            </w:r>
+          </w:p>
+        </w:tc>
+        <w:tc>
+          <w:tcPr>
+            <w:tcW w:type="dxa" w:w="3312"/>
+          </w:tcPr>
+          <w:p>
+            <w:pPr>
+              <w:spacing w:after="40"/>
+            </w:pPr>
+            <w:r>
+              <w:rPr>
+                <w:sz w:val="19"/>
+              </w:rPr>
+            </w:r>
+            <w:r>
+              <w:rPr>
+                <w:sz w:val="19"/>
+              </w:rPr>
+              <w:t>KSh 900–1,500</w:t>
+            </w:r>
+          </w:p>
+        </w:tc>
+      </w:tr>
+      <w:tr>
+        <w:tc>
+          <w:tcPr>
+            <w:tcW w:type="dxa" w:w="3312"/>
+          </w:tcPr>
+          <w:p>
+            <w:pPr>
+              <w:spacing w:after="40"/>
+            </w:pPr>
+            <w:r>
+              <w:rPr>
+                <w:sz w:val="19"/>
+              </w:rPr>
+            </w:r>
+            <w:r>
+              <w:rPr>
+                <w:sz w:val="19"/>
+              </w:rPr>
+              <w:t>Where</w:t>
+            </w:r>
+          </w:p>
+        </w:tc>
+        <w:tc>
+          <w:tcPr>
+            <w:tcW w:type="dxa" w:w="3312"/>
+          </w:tcPr>
+          <w:p>
+            <w:pPr>
+              <w:spacing w:after="40"/>
+            </w:pPr>
+            <w:r>
+              <w:rPr>
+                <w:sz w:val="19"/>
+              </w:rPr>
+            </w:r>
+            <w:r>
+              <w:rPr>
+                <w:sz w:val="19"/>
+              </w:rPr>
+              <w:t>Industrial Area godown</w:t>
+            </w:r>
+          </w:p>
+        </w:tc>
+        <w:tc>
+          <w:tcPr>
+            <w:tcW w:type="dxa" w:w="3312"/>
+          </w:tcPr>
+          <w:p>
+            <w:pPr>
+              <w:spacing w:after="40"/>
+            </w:pPr>
+            <w:r>
+              <w:rPr>
+                <w:sz w:val="19"/>
+              </w:rPr>
+            </w:r>
+            <w:r>
+              <w:rPr>
+                <w:sz w:val="19"/>
+              </w:rPr>
+              <w:t>Eastleigh / CBD importers</w:t>
+            </w:r>
+          </w:p>
+        </w:tc>
+      </w:tr>
+      <w:tr>
+        <w:tc>
+          <w:tcPr>
+            <w:tcW w:type="dxa" w:w="3312"/>
+          </w:tcPr>
+          <w:p>
+            <w:pPr>
+              <w:spacing w:after="40"/>
+            </w:pPr>
+            <w:r>
+              <w:rPr>
+                <w:sz w:val="19"/>
+              </w:rPr>
+            </w:r>
+            <w:r>
+              <w:rPr>
+                <w:sz w:val="19"/>
+              </w:rPr>
+              <w:t>Look</w:t>
+            </w:r>
+          </w:p>
+        </w:tc>
+        <w:tc>
+          <w:tcPr>
+            <w:tcW w:type="dxa" w:w="3312"/>
+          </w:tcPr>
+          <w:p>
+            <w:pPr>
+              <w:spacing w:after="40"/>
+            </w:pPr>
+            <w:r>
+              <w:rPr>
+                <w:sz w:val="19"/>
+              </w:rPr>
+            </w:r>
+            <w:r>
+              <w:rPr>
+                <w:sz w:val="19"/>
+              </w:rPr>
+              <w:t>Plain cotton polo</w:t>
+            </w:r>
+          </w:p>
+        </w:tc>
+        <w:tc>
+          <w:tcPr>
+            <w:tcW w:type="dxa" w:w="3312"/>
+          </w:tcPr>
+          <w:p>
+            <w:pPr>
+              <w:spacing w:after="40"/>
+            </w:pPr>
+            <w:r>
+              <w:rPr>
+                <w:sz w:val="19"/>
+              </w:rPr>
+            </w:r>
+            <w:r>
+              <w:rPr>
+                <w:sz w:val="19"/>
+              </w:rPr>
+              <w:t>Textured knit, tipped collar</w:t>
+            </w:r>
+          </w:p>
+        </w:tc>
+      </w:tr>
+      <w:tr>
+        <w:tc>
+          <w:tcPr>
+            <w:tcW w:type="dxa" w:w="3312"/>
+          </w:tcPr>
+          <w:p>
+            <w:pPr>
+              <w:spacing w:after="40"/>
+            </w:pPr>
+            <w:r>
+              <w:rPr>
+                <w:sz w:val="19"/>
+              </w:rPr>
+            </w:r>
+            <w:r>
+              <w:rPr>
+                <w:sz w:val="19"/>
+              </w:rPr>
+              <w:t>Kampala selling price</w:t>
+            </w:r>
+          </w:p>
+        </w:tc>
+        <w:tc>
+          <w:tcPr>
+            <w:tcW w:type="dxa" w:w="3312"/>
+          </w:tcPr>
+          <w:p>
+            <w:pPr>
+              <w:spacing w:after="40"/>
+            </w:pPr>
+            <w:r>
+              <w:rPr>
+                <w:sz w:val="19"/>
+              </w:rPr>
+            </w:r>
+            <w:r>
+              <w:rPr>
+                <w:b/>
+                <w:sz w:val="19"/>
+              </w:rPr>
+              <w:t>UGX 25,000–30,000</w:t>
+            </w:r>
+          </w:p>
+        </w:tc>
+        <w:tc>
+          <w:tcPr>
+            <w:tcW w:type="dxa" w:w="3312"/>
+          </w:tcPr>
+          <w:p>
+            <w:pPr>
+              <w:spacing w:after="40"/>
+            </w:pPr>
+            <w:r>
+              <w:rPr>
+                <w:sz w:val="19"/>
+              </w:rPr>
+            </w:r>
+            <w:r>
+              <w:rPr>
+                <w:sz w:val="19"/>
+              </w:rPr>
+              <w:t>UGX 45,000</w:t>
+            </w:r>
+          </w:p>
+        </w:tc>
+      </w:tr>
+    </w:tbl>
+    <w:p/>
+    <w:p>
+      <w:pPr>
+        <w:pStyle w:val="Heading2"/>
+      </w:pPr>
+      <w:r>
+        <w:t>Your real choice, with 2 hours left</w:t>
+      </w:r>
+    </w:p>
+    <w:p>
+      <w:pPr>
+        <w:spacing w:after="120"/>
+      </w:pPr>
+      <w:r>
+        <w:rPr>
+          <w:b/>
+        </w:rPr>
+        <w:t>Option A — Godown basics (today only)</w:t>
+      </w:r>
+    </w:p>
+    <w:p>
+      <w:pPr>
+        <w:pStyle w:val="ListBullet"/>
+        <w:spacing w:after="60"/>
+      </w:pPr>
+      <w:r>
+        <w:t>50 basic polos @ KSh 350 + 50 tees @ KSh 200 = KSh 27,500</w:t>
+      </w:r>
+    </w:p>
+    <w:p>
+      <w:pPr>
+        <w:pStyle w:val="ListBullet"/>
+        <w:spacing w:after="60"/>
+      </w:pPr>
+      <w:r>
+        <w:t>Sell polos at UGX 30,000, tees at UGX 25,000</w:t>
+      </w:r>
+    </w:p>
+    <w:p>
+      <w:pPr>
+        <w:pStyle w:val="ListBullet"/>
+        <w:spacing w:after="60"/>
+      </w:pPr>
+      <w:r>
+        <w:t xml:space="preserve">Revenue: 1,500,000 + 1,250,000 = </w:t>
+      </w:r>
+      <w:r>
+        <w:rPr>
+          <w:b/>
+        </w:rPr>
+        <w:t>UGX 2,750,000</w:t>
+      </w:r>
+    </w:p>
+    <w:p>
+      <w:pPr>
+        <w:pStyle w:val="ListBullet"/>
+        <w:spacing w:after="60"/>
+      </w:pPr>
+      <w:r>
+        <w:rPr>
+          <w:b/>
+        </w:rPr>
+        <w:t>Profit ≈ 1,143,000 UGX</w:t>
+      </w:r>
+      <w:r>
+        <w:t xml:space="preserve"> · ✅ Legal, safe, fast, high volume</w:t>
+      </w:r>
+    </w:p>
+    <w:p>
+      <w:pPr>
+        <w:spacing w:after="120"/>
+      </w:pPr>
+      <w:r>
+        <w:rPr>
+          <w:b/>
+        </w:rPr>
+        <w:t>Option B — Eastleigh fashion items (Sunday)</w:t>
+      </w:r>
+    </w:p>
+    <w:p>
+      <w:pPr>
+        <w:pStyle w:val="ListBullet"/>
+        <w:spacing w:after="60"/>
+      </w:pPr>
+      <w:r>
+        <w:t>~20 fashion polos / Cuban shirts @ KSh 900–1,200 = ~KSh 20,000</w:t>
+      </w:r>
+    </w:p>
+    <w:p>
+      <w:pPr>
+        <w:pStyle w:val="ListBullet"/>
+        <w:spacing w:after="60"/>
+      </w:pPr>
+      <w:r>
+        <w:t>Sell at UGX 45,000 each</w:t>
+      </w:r>
+    </w:p>
+    <w:p>
+      <w:pPr>
+        <w:pStyle w:val="ListBullet"/>
+        <w:spacing w:after="60"/>
+      </w:pPr>
+      <w:r>
+        <w:t>Revenue: ~UGX 900,000 on the same money</w:t>
+      </w:r>
+    </w:p>
+    <w:p>
+      <w:pPr>
+        <w:pStyle w:val="ListBullet"/>
+        <w:spacing w:after="60"/>
+      </w:pPr>
+      <w:r>
+        <w:rPr>
+          <w:b/>
+        </w:rPr>
+        <w:t>Profit much lower per shilling</w:t>
+      </w:r>
+      <w:r>
+        <w:t xml:space="preserve"> · ⚠️ Closer to your pics, but thin margins</w:t>
+      </w:r>
+    </w:p>
+    <w:p>
+      <w:pPr>
+        <w:spacing w:after="120"/>
+      </w:pPr>
+      <w:r>
+        <w:rPr>
+          <w:b/>
+        </w:rPr>
+        <w:t>Option A makes more money.</w:t>
+      </w:r>
+      <w:r>
+        <w:t xml:space="preserve"> Option B looks more like your inspiration photos but returns far less.</w:t>
+      </w:r>
+    </w:p>
+    <w:p>
+      <w:pPr>
+        <w:pStyle w:val="Heading2"/>
+      </w:pPr>
+      <w:r>
+        <w:t>⚠️ If you buy the branded-look ones — the legal line</w:t>
+      </w:r>
+    </w:p>
+    <w:p>
+      <w:pPr>
+        <w:spacing w:after="120"/>
+      </w:pPr>
+      <w:r>
+        <w:t xml:space="preserve">This is serious and it lands on </w:t>
+      </w:r>
+      <w:r>
+        <w:rPr>
+          <w:b/>
+        </w:rPr>
+        <w:t>you</w:t>
+      </w:r>
+      <w:r>
+        <w:t>, not the factory that made them.</w:t>
+      </w:r>
+    </w:p>
+    <w:p>
+      <w:pPr>
+        <w:pStyle w:val="ListBullet"/>
+        <w:spacing w:after="60"/>
+      </w:pPr>
+      <w:r>
+        <w:rPr>
+          <w:b/>
+        </w:rPr>
+        <w:t>Uganda Penal Code Act, Section 379</w:t>
+      </w:r>
+      <w:r>
+        <w:t xml:space="preserve"> — selling goods with a counterfeit trademark is a </w:t>
+      </w:r>
+      <w:r>
+        <w:rPr>
+          <w:b/>
+        </w:rPr>
+        <w:t>misdemeanour, up to 2 years imprisonment</w:t>
+      </w:r>
+      <w:r>
+        <w:t>. It applies even to possession for sale.</w:t>
+      </w:r>
+    </w:p>
+    <w:p>
+      <w:pPr>
+        <w:pStyle w:val="ListBullet"/>
+        <w:spacing w:after="60"/>
+      </w:pPr>
+      <w:r>
+        <w:rPr>
+          <w:b/>
+        </w:rPr>
+        <w:t>Anti-Counterfeit Goods and Services Bill (2023/2024)</w:t>
+      </w:r>
+      <w:r>
+        <w:t xml:space="preserve"> — proposes up to </w:t>
+      </w:r>
+      <w:r>
+        <w:rPr>
+          <w:b/>
+        </w:rPr>
+        <w:t>10 years imprisonment</w:t>
+      </w:r>
+      <w:r>
+        <w:t xml:space="preserve"> and a fine of </w:t>
+      </w:r>
+      <w:r>
+        <w:rPr>
+          <w:b/>
+        </w:rPr>
+        <w:t>up to 5× the retail price of the genuine good</w:t>
+      </w:r>
+      <w:r>
+        <w:t>, plus licence cancellation and confiscation.</w:t>
+      </w:r>
+    </w:p>
+    <w:p>
+      <w:pPr>
+        <w:pStyle w:val="ListBullet"/>
+        <w:spacing w:after="60"/>
+      </w:pPr>
+      <w:r>
+        <w:t xml:space="preserve">UNBS reports roughly </w:t>
+      </w:r>
+      <w:r>
+        <w:rPr>
+          <w:b/>
+        </w:rPr>
+        <w:t>58% of products on the Ugandan market are counterfeit</w:t>
+      </w:r>
+      <w:r>
+        <w:t>, so enforcement is inconsistent — but that means periodic crackdowns, not safety.</w:t>
+      </w:r>
+    </w:p>
+    <w:p>
+      <w:pPr>
+        <w:spacing w:after="120"/>
+      </w:pPr>
+      <w:r>
+        <w:rPr>
+          <w:b/>
+        </w:rPr>
+        <w:t>Bottom line:</w:t>
+      </w:r>
+      <w:r>
+        <w:t xml:space="preserve"> you may sell unbranded fashion freely. </w:t>
+      </w:r>
+      <w:r>
+        <w:rPr>
+          <w:b/>
+        </w:rPr>
+        <w:t>Do not sell goods marked U.S. Polo Assn., Timberland, aape or similar unless they are genuine</w:t>
+      </w:r>
+      <w:r>
+        <w:t xml:space="preserve"> — and at these prices they are not.</w:t>
+      </w:r>
+    </w:p>
+    <w:p>
+      <w:pPr>
+        <w:pStyle w:val="Heading2"/>
+      </w:pPr>
+      <w:r>
+        <w:t>What I'd do</w:t>
+      </w:r>
+    </w:p>
+    <w:p>
+      <w:pPr>
+        <w:spacing w:after="120"/>
+      </w:pPr>
+      <w:r>
+        <w:rPr>
+          <w:b/>
+        </w:rPr>
+        <w:t>Go to the godown today and buy basics (Option A).</w:t>
+      </w:r>
+      <w:r>
+        <w:t xml:space="preserve"> It's legal, it's cheapest, it's fastest, and it makes the most money. The fashion items in your pics can be your </w:t>
+      </w:r>
+      <w:r>
+        <w:rPr>
+          <w:b/>
+        </w:rPr>
+        <w:t>next</w:t>
+      </w:r>
+      <w:r>
+        <w:t xml:space="preserve"> trip — once you've sold these and know what your customers actually buy.</w:t>
+      </w:r>
+    </w:p>
+    <w:p>
+      <w:pPr>
+        <w:spacing w:after="120"/>
+      </w:pPr>
+      <w:r>
+        <w:t>If a customer asks for the branded look, that's information for trip two. Don't gamble your whole budget on it today.</w:t>
+      </w:r>
+    </w:p>
+    <w:p>
+      <w:pPr>
+        <w:pBdr>
+          <w:bottom w:val="single" w:sz="6" w:color="BFBFBF"/>
+        </w:pBdr>
+      </w:pPr>
+    </w:p>
+    <w:p>
+      <w:pPr>
+        <w:pStyle w:val="Heading1"/>
+      </w:pPr>
+      <w:r>
         <w:t>Timeline for the rest of today</w:t>
       </w:r>
     </w:p>

</xml_diff>